<commit_message>
1/12/25 Added unittest file and smaller changes thorughout project
</commit_message>
<xml_diff>
--- a/IO-IoT-Prj.docx
+++ b/IO-IoT-Prj.docx
@@ -275,6 +275,7 @@
                   <w14:uncheckedState w14:val="2610" w14:font="MS Gothic"/>
                 </w14:checkbox>
               </w:sdtPr>
+              <w:sdtEndPr/>
               <w:sdtContent>
                 <w:r>
                   <w:rPr>
@@ -321,6 +322,7 @@
                   <w14:uncheckedState w14:val="2610" w14:font="MS Gothic"/>
                 </w14:checkbox>
               </w:sdtPr>
+              <w:sdtEndPr/>
               <w:sdtContent>
                 <w:r>
                   <w:rPr>
@@ -369,6 +371,7 @@
                   <w14:uncheckedState w14:val="2610" w14:font="MS Gothic"/>
                 </w14:checkbox>
               </w:sdtPr>
+              <w:sdtEndPr/>
               <w:sdtContent>
                 <w:r>
                   <w:rPr>
@@ -420,6 +423,7 @@
                   <w14:uncheckedState w14:val="2610" w14:font="MS Gothic"/>
                 </w14:checkbox>
               </w:sdtPr>
+              <w:sdtEndPr/>
               <w:sdtContent>
                 <w:r>
                   <w:rPr>
@@ -469,6 +473,7 @@
                   <w14:uncheckedState w14:val="2610" w14:font="MS Gothic"/>
                 </w14:checkbox>
               </w:sdtPr>
+              <w:sdtEndPr/>
               <w:sdtContent>
                 <w:r>
                   <w:rPr>
@@ -523,6 +528,7 @@
                   <w14:uncheckedState w14:val="2610" w14:font="MS Gothic"/>
                 </w14:checkbox>
               </w:sdtPr>
+              <w:sdtEndPr/>
               <w:sdtContent>
                 <w:r>
                   <w:rPr>
@@ -739,16 +745,8 @@
               <w:rPr>
                 <w:rStyle w:val="Emphasis"/>
               </w:rPr>
-              <w:t xml:space="preserve"> with </w:t>
-            </w:r>
-            <w:proofErr w:type="spellStart"/>
-            <w:r>
-              <w:rPr>
-                <w:rStyle w:val="Emphasis"/>
-              </w:rPr>
-              <w:t>SenseHat</w:t>
-            </w:r>
-            <w:proofErr w:type="spellEnd"/>
+              <w:t xml:space="preserve"> with SenseHat</w:t>
+            </w:r>
           </w:p>
           <w:p>
             <w:pPr>
@@ -1332,21 +1330,7 @@
               <w:rPr>
                 <w:rStyle w:val="Emphasis"/>
               </w:rPr>
-              <w:t xml:space="preserve">Include </w:t>
-            </w:r>
-            <w:proofErr w:type="gramStart"/>
-            <w:r>
-              <w:rPr>
-                <w:rStyle w:val="Emphasis"/>
-              </w:rPr>
-              <w:t>your .git</w:t>
-            </w:r>
-            <w:proofErr w:type="gramEnd"/>
-            <w:r>
-              <w:rPr>
-                <w:rStyle w:val="Emphasis"/>
-              </w:rPr>
-              <w:t xml:space="preserve">/ folder. </w:t>
+              <w:t xml:space="preserve">Include your .git/ folder. </w:t>
             </w:r>
             <w:r>
               <w:rPr>
@@ -1355,7 +1339,6 @@
               </w:rPr>
               <w:t>Remove the virtual environment (</w:t>
             </w:r>
-            <w:proofErr w:type="spellStart"/>
             <w:r>
               <w:rPr>
                 <w:rStyle w:val="Emphasis"/>
@@ -1367,21 +1350,12 @@
               </w:rPr>
               <w:t>venv</w:t>
             </w:r>
-            <w:proofErr w:type="spellEnd"/>
             <w:r>
               <w:rPr>
                 <w:rStyle w:val="Emphasis"/>
                 <w:u w:val="single"/>
               </w:rPr>
-              <w:t xml:space="preserve"> </w:t>
-            </w:r>
-            <w:proofErr w:type="gramStart"/>
-            <w:r>
-              <w:rPr>
-                <w:rStyle w:val="Emphasis"/>
-                <w:u w:val="single"/>
-              </w:rPr>
-              <w:t xml:space="preserve">or </w:t>
+              <w:t xml:space="preserve"> or </w:t>
             </w:r>
             <w:r>
               <w:rPr>
@@ -1392,22 +1366,8 @@
                 <w:iCs w:val="0"/>
                 <w:u w:val="single"/>
               </w:rPr>
-              <w:t>.</w:t>
-            </w:r>
-            <w:proofErr w:type="spellStart"/>
-            <w:r>
-              <w:rPr>
-                <w:rStyle w:val="Emphasis"/>
-                <w:rFonts w:ascii="Courier New" w:hAnsi="Courier New" w:cs="Courier New"/>
-                <w:b/>
-                <w:i w:val="0"/>
-                <w:iCs w:val="0"/>
-                <w:u w:val="single"/>
-              </w:rPr>
-              <w:t>venv</w:t>
-            </w:r>
-            <w:proofErr w:type="spellEnd"/>
-            <w:proofErr w:type="gramEnd"/>
+              <w:t>.venv</w:t>
+            </w:r>
             <w:r>
               <w:rPr>
                 <w:rStyle w:val="Emphasis"/>
@@ -1504,15 +1464,7 @@
               <w:spacing w:before="240"/>
             </w:pPr>
             <w:r>
-              <w:t>If you use ChatGPT or any other LLM/</w:t>
-            </w:r>
-            <w:proofErr w:type="gramStart"/>
-            <w:r>
-              <w:t>AI</w:t>
-            </w:r>
-            <w:proofErr w:type="gramEnd"/>
-            <w:r>
-              <w:t xml:space="preserve"> you must appropriately reference any conversations. The code you write must be original to you. </w:t>
+              <w:t xml:space="preserve">If you use ChatGPT or any other LLM/AI you must appropriately reference any conversations. The code you write must be original to you. </w:t>
             </w:r>
             <w:r>
               <w:rPr>
@@ -1662,15 +1614,7 @@
     </w:p>
     <w:p>
       <w:r>
-        <w:t xml:space="preserve">Evidence for the above will be collected via access to your .git file and your remote repository. Ensure your lecturer </w:t>
-      </w:r>
-      <w:proofErr w:type="gramStart"/>
-      <w:r>
-        <w:t>is able to</w:t>
-      </w:r>
-      <w:proofErr w:type="gramEnd"/>
-      <w:r>
-        <w:t xml:space="preserve"> access the remote.</w:t>
+        <w:t>Evidence for the above will be collected via access to your .git file and your remote repository. Ensure your lecturer is able to access the remote.</w:t>
       </w:r>
     </w:p>
     <w:p>
@@ -1734,9 +1678,9 @@
         <w:tblLook w:val="04A0" w:firstRow="1" w:lastRow="0" w:firstColumn="1" w:lastColumn="0" w:noHBand="0" w:noVBand="1"/>
       </w:tblPr>
       <w:tblGrid>
-        <w:gridCol w:w="1221"/>
-        <w:gridCol w:w="2052"/>
-        <w:gridCol w:w="4811"/>
+        <w:gridCol w:w="1260"/>
+        <w:gridCol w:w="3850"/>
+        <w:gridCol w:w="2974"/>
       </w:tblGrid>
       <w:tr>
         <w:trPr>
@@ -1873,6 +1817,22 @@
                 <w:color w:val="000000"/>
               </w:rPr>
             </w:pPr>
+            <w:r>
+              <w:rPr>
+                <w:rFonts w:ascii="Helvetica Neue" w:hAnsi="Helvetica Neue"/>
+                <w:b/>
+                <w:color w:val="000000"/>
+              </w:rPr>
+              <w:t>28</w:t>
+            </w:r>
+            <w:r>
+              <w:rPr>
+                <w:rFonts w:ascii="Helvetica Neue" w:hAnsi="Helvetica Neue"/>
+                <w:b/>
+                <w:color w:val="000000"/>
+              </w:rPr>
+              <w:t>/11/25</w:t>
+            </w:r>
           </w:p>
         </w:tc>
         <w:tc>
@@ -1896,6 +1856,13 @@
                 <w:szCs w:val="20"/>
               </w:rPr>
             </w:pPr>
+            <w:r>
+              <w:rPr>
+                <w:sz w:val="20"/>
+                <w:szCs w:val="20"/>
+              </w:rPr>
+              <w:t>As a driver, I want to know the number of available parking spots in a parking lot so that I can quickly find a spot to park my car</w:t>
+            </w:r>
           </w:p>
         </w:tc>
         <w:tc>
@@ -1919,6 +1886,34 @@
                 <w:szCs w:val="20"/>
               </w:rPr>
             </w:pPr>
+            <w:r>
+              <w:rPr>
+                <w:sz w:val="20"/>
+                <w:szCs w:val="20"/>
+              </w:rPr>
+              <w:t xml:space="preserve">Second </w:t>
+            </w:r>
+            <w:r>
+              <w:rPr>
+                <w:sz w:val="20"/>
+                <w:szCs w:val="20"/>
+              </w:rPr>
+              <w:t>windows</w:t>
+            </w:r>
+            <w:r>
+              <w:rPr>
+                <w:sz w:val="20"/>
+                <w:szCs w:val="20"/>
+              </w:rPr>
+              <w:t xml:space="preserve"> tracks and shows the </w:t>
+            </w:r>
+            <w:r>
+              <w:rPr>
+                <w:sz w:val="20"/>
+                <w:szCs w:val="20"/>
+              </w:rPr>
+              <w:t>no. of available spots</w:t>
+            </w:r>
           </w:p>
         </w:tc>
       </w:tr>
@@ -1944,6 +1939,16 @@
                 <w:szCs w:val="20"/>
               </w:rPr>
             </w:pPr>
+            <w:r>
+              <w:rPr>
+                <w:sz w:val="20"/>
+                <w:szCs w:val="20"/>
+              </w:rPr>
+              <w:t>3</w:t>
+            </w:r>
+            <w:r>
+              <w:t>0/11/25</w:t>
+            </w:r>
           </w:p>
         </w:tc>
         <w:tc>
@@ -1967,6 +1972,13 @@
                 <w:szCs w:val="20"/>
               </w:rPr>
             </w:pPr>
+            <w:r>
+              <w:rPr>
+                <w:sz w:val="20"/>
+                <w:szCs w:val="20"/>
+              </w:rPr>
+              <w:t>As a driver, I want to see the current temperature and time while checking for parking availability so that I can plan my activities accordingly.</w:t>
+            </w:r>
           </w:p>
         </w:tc>
         <w:tc>
@@ -1990,6 +2002,48 @@
                 <w:szCs w:val="20"/>
               </w:rPr>
             </w:pPr>
+            <w:r>
+              <w:rPr>
+                <w:sz w:val="20"/>
+                <w:szCs w:val="20"/>
+              </w:rPr>
+              <w:t xml:space="preserve">Second </w:t>
+            </w:r>
+            <w:r>
+              <w:rPr>
+                <w:sz w:val="20"/>
+                <w:szCs w:val="20"/>
+              </w:rPr>
+              <w:t>window</w:t>
+            </w:r>
+            <w:r>
+              <w:rPr>
+                <w:sz w:val="20"/>
+                <w:szCs w:val="20"/>
+              </w:rPr>
+              <w:t xml:space="preserve"> shows the </w:t>
+            </w:r>
+            <w:r>
+              <w:rPr>
+                <w:sz w:val="20"/>
+                <w:szCs w:val="20"/>
+              </w:rPr>
+              <w:t xml:space="preserve">set </w:t>
+            </w:r>
+            <w:r>
+              <w:rPr>
+                <w:sz w:val="20"/>
+                <w:szCs w:val="20"/>
+              </w:rPr>
+              <w:t>temperature</w:t>
+            </w:r>
+            <w:r>
+              <w:rPr>
+                <w:sz w:val="20"/>
+                <w:szCs w:val="20"/>
+              </w:rPr>
+              <w:t xml:space="preserve"> and current time</w:t>
+            </w:r>
           </w:p>
         </w:tc>
       </w:tr>
@@ -2015,6 +2069,16 @@
                 <w:szCs w:val="20"/>
               </w:rPr>
             </w:pPr>
+            <w:r>
+              <w:rPr>
+                <w:sz w:val="20"/>
+                <w:szCs w:val="20"/>
+              </w:rPr>
+              <w:t>3</w:t>
+            </w:r>
+            <w:r>
+              <w:t>0/11/25</w:t>
+            </w:r>
           </w:p>
         </w:tc>
         <w:tc>
@@ -2038,6 +2102,13 @@
                 <w:szCs w:val="20"/>
               </w:rPr>
             </w:pPr>
+            <w:r>
+              <w:rPr>
+                <w:sz w:val="20"/>
+                <w:szCs w:val="20"/>
+              </w:rPr>
+              <w:t>As a parking lot manager, I want to track cars entering and leaving the parking lot in real-time so that I can manage parking resources effectively.</w:t>
+            </w:r>
           </w:p>
         </w:tc>
         <w:tc>
@@ -2057,10 +2128,33 @@
             <w:pPr>
               <w:spacing w:before="150" w:after="225"/>
               <w:rPr>
+                <w:i/>
+                <w:iCs/>
                 <w:sz w:val="20"/>
                 <w:szCs w:val="20"/>
               </w:rPr>
             </w:pPr>
+            <w:r>
+              <w:rPr>
+                <w:sz w:val="20"/>
+                <w:szCs w:val="20"/>
+              </w:rPr>
+              <w:t xml:space="preserve">First window </w:t>
+            </w:r>
+            <w:r>
+              <w:rPr>
+                <w:sz w:val="20"/>
+                <w:szCs w:val="20"/>
+              </w:rPr>
+              <w:t xml:space="preserve">has buttons that change and track the entering and exiting of cars </w:t>
+            </w:r>
+            <w:r>
+              <w:rPr>
+                <w:sz w:val="20"/>
+                <w:szCs w:val="20"/>
+              </w:rPr>
+              <w:t>in real-time</w:t>
+            </w:r>
           </w:p>
         </w:tc>
       </w:tr>
@@ -2108,12 +2202,61 @@
           <w:color w:val="000000"/>
         </w:rPr>
       </w:pPr>
+    </w:p>
+    <w:p>
+      <w:pPr>
+        <w:pStyle w:val="NormalWeb"/>
+        <w:shd w:val="clear" w:color="auto" w:fill="FFFFFF"/>
+        <w:spacing w:before="0" w:beforeAutospacing="0" w:after="240" w:afterAutospacing="0"/>
+        <w:rPr>
+          <w:rStyle w:val="Strong"/>
+          <w:rFonts w:ascii="Helvetica Neue" w:hAnsi="Helvetica Neue"/>
+          <w:color w:val="000000"/>
+        </w:rPr>
+      </w:pPr>
+    </w:p>
+    <w:p>
+      <w:pPr>
+        <w:pStyle w:val="NormalWeb"/>
+        <w:shd w:val="clear" w:color="auto" w:fill="FFFFFF"/>
+        <w:spacing w:before="0" w:beforeAutospacing="0" w:after="240" w:afterAutospacing="0"/>
+        <w:rPr>
+          <w:rStyle w:val="Strong"/>
+          <w:rFonts w:ascii="Helvetica Neue" w:hAnsi="Helvetica Neue"/>
+          <w:color w:val="000000"/>
+        </w:rPr>
+      </w:pPr>
+    </w:p>
+    <w:p>
+      <w:pPr>
+        <w:pStyle w:val="NormalWeb"/>
+        <w:shd w:val="clear" w:color="auto" w:fill="FFFFFF"/>
+        <w:spacing w:before="0" w:beforeAutospacing="0" w:after="240" w:afterAutospacing="0"/>
+        <w:rPr>
+          <w:rStyle w:val="Strong"/>
+          <w:rFonts w:ascii="Helvetica Neue" w:hAnsi="Helvetica Neue"/>
+          <w:color w:val="000000"/>
+        </w:rPr>
+      </w:pPr>
+    </w:p>
+    <w:p>
+      <w:pPr>
+        <w:pStyle w:val="NormalWeb"/>
+        <w:shd w:val="clear" w:color="auto" w:fill="FFFFFF"/>
+        <w:spacing w:before="0" w:beforeAutospacing="0" w:after="240" w:afterAutospacing="0"/>
+        <w:rPr>
+          <w:rStyle w:val="Strong"/>
+          <w:rFonts w:ascii="Helvetica Neue" w:hAnsi="Helvetica Neue"/>
+          <w:color w:val="000000"/>
+        </w:rPr>
+      </w:pPr>
       <w:r>
         <w:rPr>
           <w:rStyle w:val="Strong"/>
           <w:rFonts w:ascii="Helvetica Neue" w:hAnsi="Helvetica Neue"/>
           <w:color w:val="000000"/>
         </w:rPr>
+        <w:lastRenderedPageBreak/>
         <w:t>Section 2: Test Documentation</w:t>
       </w:r>
     </w:p>
@@ -2138,10 +2281,10 @@
         <w:tblLook w:val="04A0" w:firstRow="1" w:lastRow="0" w:firstColumn="1" w:lastColumn="0" w:noHBand="0" w:noVBand="1"/>
       </w:tblPr>
       <w:tblGrid>
-        <w:gridCol w:w="2126"/>
-        <w:gridCol w:w="1985"/>
-        <w:gridCol w:w="2121"/>
-        <w:gridCol w:w="2552"/>
+        <w:gridCol w:w="1560"/>
+        <w:gridCol w:w="3019"/>
+        <w:gridCol w:w="672"/>
+        <w:gridCol w:w="3868"/>
       </w:tblGrid>
       <w:tr>
         <w:trPr>
@@ -2149,7 +2292,7 @@
         </w:trPr>
         <w:tc>
           <w:tcPr>
-            <w:tcW w:w="2126" w:type="dxa"/>
+            <w:tcW w:w="2069" w:type="dxa"/>
             <w:shd w:val="clear" w:color="auto" w:fill="FFFFFF"/>
             <w:tcMar>
               <w:top w:w="90" w:type="dxa"/>
@@ -2184,7 +2327,7 @@
         </w:tc>
         <w:tc>
           <w:tcPr>
-            <w:tcW w:w="1985" w:type="dxa"/>
+            <w:tcW w:w="1575" w:type="dxa"/>
             <w:shd w:val="clear" w:color="auto" w:fill="FFFFFF"/>
             <w:tcMar>
               <w:top w:w="90" w:type="dxa"/>
@@ -2219,7 +2362,7 @@
         </w:tc>
         <w:tc>
           <w:tcPr>
-            <w:tcW w:w="2121" w:type="dxa"/>
+            <w:tcW w:w="1272" w:type="dxa"/>
           </w:tcPr>
           <w:p>
             <w:pPr>
@@ -2245,7 +2388,7 @@
         </w:tc>
         <w:tc>
           <w:tcPr>
-            <w:tcW w:w="2552" w:type="dxa"/>
+            <w:tcW w:w="3868" w:type="dxa"/>
           </w:tcPr>
           <w:p>
             <w:pPr>
@@ -2273,7 +2416,7 @@
       <w:tr>
         <w:tc>
           <w:tcPr>
-            <w:tcW w:w="2126" w:type="dxa"/>
+            <w:tcW w:w="2069" w:type="dxa"/>
             <w:shd w:val="clear" w:color="auto" w:fill="FFFFFF"/>
             <w:tcMar>
               <w:top w:w="90" w:type="dxa"/>
@@ -2292,11 +2435,27 @@
                 <w:szCs w:val="20"/>
               </w:rPr>
             </w:pPr>
+            <w:r>
+              <w:rPr>
+                <w:sz w:val="20"/>
+                <w:szCs w:val="20"/>
+              </w:rPr>
+              <w:t>Test 1: config.json if being read correctly</w:t>
+            </w:r>
+          </w:p>
+          <w:p>
+            <w:pPr>
+              <w:spacing w:before="150" w:after="225"/>
+              <w:rPr>
+                <w:sz w:val="20"/>
+                <w:szCs w:val="20"/>
+              </w:rPr>
+            </w:pPr>
           </w:p>
         </w:tc>
         <w:tc>
           <w:tcPr>
-            <w:tcW w:w="1985" w:type="dxa"/>
+            <w:tcW w:w="1575" w:type="dxa"/>
             <w:shd w:val="clear" w:color="auto" w:fill="FFFFFF"/>
             <w:tcMar>
               <w:top w:w="90" w:type="dxa"/>
@@ -2315,11 +2474,34 @@
                 <w:szCs w:val="20"/>
               </w:rPr>
             </w:pPr>
+            <w:r>
+              <w:rPr>
+                <w:sz w:val="20"/>
+                <w:szCs w:val="20"/>
+              </w:rPr>
+              <w:t>S</w:t>
+            </w:r>
+            <w:r>
+              <w:rPr>
+                <w:sz w:val="20"/>
+                <w:szCs w:val="20"/>
+              </w:rPr>
+              <w:t>et config["CarParks]["free-spaces] = 1000</w:t>
+            </w:r>
+          </w:p>
+          <w:p>
+            <w:pPr>
+              <w:spacing w:before="150" w:after="225"/>
+              <w:rPr>
+                <w:sz w:val="20"/>
+                <w:szCs w:val="20"/>
+              </w:rPr>
+            </w:pPr>
           </w:p>
         </w:tc>
         <w:tc>
           <w:tcPr>
-            <w:tcW w:w="2121" w:type="dxa"/>
+            <w:tcW w:w="1272" w:type="dxa"/>
           </w:tcPr>
           <w:p>
             <w:pPr>
@@ -2333,7 +2515,7 @@
         </w:tc>
         <w:tc>
           <w:tcPr>
-            <w:tcW w:w="2552" w:type="dxa"/>
+            <w:tcW w:w="3868" w:type="dxa"/>
           </w:tcPr>
           <w:p>
             <w:pPr>
@@ -2343,13 +2525,36 @@
                 <w:szCs w:val="20"/>
               </w:rPr>
             </w:pPr>
+            <w:r>
+              <w:rPr>
+                <w:sz w:val="20"/>
+                <w:szCs w:val="20"/>
+              </w:rPr>
+              <w:t>self.assertEqual(1000,carpark.available_spaces)</w:t>
+            </w:r>
+          </w:p>
+          <w:p>
+            <w:pPr>
+              <w:spacing w:before="150" w:after="225"/>
+              <w:rPr>
+                <w:sz w:val="20"/>
+                <w:szCs w:val="20"/>
+              </w:rPr>
+            </w:pPr>
+            <w:r>
+              <w:rPr>
+                <w:sz w:val="20"/>
+                <w:szCs w:val="20"/>
+              </w:rPr>
+              <w:t>True</w:t>
+            </w:r>
           </w:p>
         </w:tc>
       </w:tr>
       <w:tr>
         <w:tc>
           <w:tcPr>
-            <w:tcW w:w="2126" w:type="dxa"/>
+            <w:tcW w:w="2069" w:type="dxa"/>
             <w:shd w:val="clear" w:color="auto" w:fill="FFFFFF"/>
             <w:tcMar>
               <w:top w:w="90" w:type="dxa"/>
@@ -2368,11 +2573,27 @@
                 <w:szCs w:val="20"/>
               </w:rPr>
             </w:pPr>
+            <w:r>
+              <w:rPr>
+                <w:sz w:val="20"/>
+                <w:szCs w:val="20"/>
+              </w:rPr>
+              <w:t>Test 2: config.json if being read correctly</w:t>
+            </w:r>
+          </w:p>
+          <w:p>
+            <w:pPr>
+              <w:spacing w:before="150" w:after="225"/>
+              <w:rPr>
+                <w:sz w:val="20"/>
+                <w:szCs w:val="20"/>
+              </w:rPr>
+            </w:pPr>
           </w:p>
         </w:tc>
         <w:tc>
           <w:tcPr>
-            <w:tcW w:w="1985" w:type="dxa"/>
+            <w:tcW w:w="1575" w:type="dxa"/>
             <w:shd w:val="clear" w:color="auto" w:fill="FFFFFF"/>
             <w:tcMar>
               <w:top w:w="90" w:type="dxa"/>
@@ -2391,11 +2612,27 @@
                 <w:szCs w:val="20"/>
               </w:rPr>
             </w:pPr>
+            <w:r>
+              <w:rPr>
+                <w:sz w:val="20"/>
+                <w:szCs w:val="20"/>
+              </w:rPr>
+              <w:t>Set config["CarParks]["temperature] = 12.0</w:t>
+            </w:r>
+          </w:p>
+          <w:p>
+            <w:pPr>
+              <w:spacing w:before="150" w:after="225"/>
+              <w:rPr>
+                <w:sz w:val="20"/>
+                <w:szCs w:val="20"/>
+              </w:rPr>
+            </w:pPr>
           </w:p>
         </w:tc>
         <w:tc>
           <w:tcPr>
-            <w:tcW w:w="2121" w:type="dxa"/>
+            <w:tcW w:w="1272" w:type="dxa"/>
           </w:tcPr>
           <w:p>
             <w:pPr>
@@ -2409,7 +2646,7 @@
         </w:tc>
         <w:tc>
           <w:tcPr>
-            <w:tcW w:w="2552" w:type="dxa"/>
+            <w:tcW w:w="3868" w:type="dxa"/>
           </w:tcPr>
           <w:p>
             <w:pPr>
@@ -2419,23 +2656,14 @@
                 <w:szCs w:val="20"/>
               </w:rPr>
             </w:pPr>
-          </w:p>
-        </w:tc>
-      </w:tr>
-      <w:tr>
-        <w:tc>
-          <w:tcPr>
-            <w:tcW w:w="2126" w:type="dxa"/>
-            <w:shd w:val="clear" w:color="auto" w:fill="FFFFFF"/>
-            <w:tcMar>
-              <w:top w:w="90" w:type="dxa"/>
-              <w:left w:w="195" w:type="dxa"/>
-              <w:bottom w:w="90" w:type="dxa"/>
-              <w:right w:w="195" w:type="dxa"/>
-            </w:tcMar>
-            <w:vAlign w:val="center"/>
-            <w:hideMark/>
-          </w:tcPr>
+            <w:r>
+              <w:rPr>
+                <w:sz w:val="20"/>
+                <w:szCs w:val="20"/>
+              </w:rPr>
+              <w:t>self.assertEqual(12.0,carpark.temperature)</w:t>
+            </w:r>
+          </w:p>
           <w:p>
             <w:pPr>
               <w:spacing w:before="150" w:after="225"/>
@@ -2444,57 +2672,13 @@
                 <w:szCs w:val="20"/>
               </w:rPr>
             </w:pPr>
-          </w:p>
-        </w:tc>
-        <w:tc>
-          <w:tcPr>
-            <w:tcW w:w="1985" w:type="dxa"/>
-            <w:shd w:val="clear" w:color="auto" w:fill="FFFFFF"/>
-            <w:tcMar>
-              <w:top w:w="90" w:type="dxa"/>
-              <w:left w:w="195" w:type="dxa"/>
-              <w:bottom w:w="90" w:type="dxa"/>
-              <w:right w:w="195" w:type="dxa"/>
-            </w:tcMar>
-            <w:vAlign w:val="center"/>
-            <w:hideMark/>
-          </w:tcPr>
-          <w:p>
-            <w:pPr>
-              <w:spacing w:before="150" w:after="225"/>
+            <w:r>
               <w:rPr>
                 <w:sz w:val="20"/>
                 <w:szCs w:val="20"/>
               </w:rPr>
-            </w:pPr>
-          </w:p>
-        </w:tc>
-        <w:tc>
-          <w:tcPr>
-            <w:tcW w:w="2121" w:type="dxa"/>
-          </w:tcPr>
-          <w:p>
-            <w:pPr>
-              <w:spacing w:before="150" w:after="225"/>
-              <w:rPr>
-                <w:sz w:val="20"/>
-                <w:szCs w:val="20"/>
-              </w:rPr>
-            </w:pPr>
-          </w:p>
-        </w:tc>
-        <w:tc>
-          <w:tcPr>
-            <w:tcW w:w="2552" w:type="dxa"/>
-          </w:tcPr>
-          <w:p>
-            <w:pPr>
-              <w:spacing w:before="150" w:after="225"/>
-              <w:rPr>
-                <w:sz w:val="20"/>
-                <w:szCs w:val="20"/>
-              </w:rPr>
-            </w:pPr>
+              <w:t>True</w:t>
+            </w:r>
           </w:p>
         </w:tc>
       </w:tr>
@@ -2567,9 +2751,9 @@
         <w:tblLook w:val="04A0" w:firstRow="1" w:lastRow="0" w:firstColumn="1" w:lastColumn="0" w:noHBand="0" w:noVBand="1"/>
       </w:tblPr>
       <w:tblGrid>
-        <w:gridCol w:w="860"/>
-        <w:gridCol w:w="2101"/>
-        <w:gridCol w:w="5123"/>
+        <w:gridCol w:w="1244"/>
+        <w:gridCol w:w="1639"/>
+        <w:gridCol w:w="5201"/>
       </w:tblGrid>
       <w:tr>
         <w:trPr>
@@ -2707,6 +2891,18 @@
                 <w:color w:val="000000"/>
               </w:rPr>
             </w:pPr>
+            <w:r>
+              <w:rPr>
+                <w:rFonts w:ascii="Helvetica Neue" w:hAnsi="Helvetica Neue"/>
+                <w:b/>
+                <w:bCs/>
+                <w:color w:val="000000"/>
+              </w:rPr>
+              <w:t>2</w:t>
+            </w:r>
+            <w:r>
+              <w:t>9/11/25</w:t>
+            </w:r>
           </w:p>
         </w:tc>
         <w:tc>
@@ -2730,6 +2926,13 @@
                 <w:szCs w:val="20"/>
               </w:rPr>
             </w:pPr>
+            <w:r>
+              <w:rPr>
+                <w:sz w:val="20"/>
+                <w:szCs w:val="20"/>
+              </w:rPr>
+              <w:t>VScode python debugger</w:t>
+            </w:r>
           </w:p>
         </w:tc>
         <w:tc>
@@ -2753,148 +2956,48 @@
                 <w:szCs w:val="20"/>
               </w:rPr>
             </w:pPr>
-          </w:p>
-        </w:tc>
-      </w:tr>
-      <w:tr>
-        <w:tc>
-          <w:tcPr>
-            <w:tcW w:w="0" w:type="auto"/>
-            <w:shd w:val="clear" w:color="auto" w:fill="FFFFFF"/>
-            <w:tcMar>
-              <w:top w:w="90" w:type="dxa"/>
-              <w:left w:w="195" w:type="dxa"/>
-              <w:bottom w:w="90" w:type="dxa"/>
-              <w:right w:w="195" w:type="dxa"/>
-            </w:tcMar>
-            <w:vAlign w:val="center"/>
-            <w:hideMark/>
-          </w:tcPr>
-          <w:p>
-            <w:pPr>
-              <w:spacing w:before="150" w:after="225"/>
+            <w:r>
               <w:rPr>
                 <w:sz w:val="20"/>
                 <w:szCs w:val="20"/>
               </w:rPr>
-            </w:pPr>
-          </w:p>
-        </w:tc>
-        <w:tc>
-          <w:tcPr>
-            <w:tcW w:w="0" w:type="auto"/>
-            <w:shd w:val="clear" w:color="auto" w:fill="FFFFFF"/>
-            <w:tcMar>
-              <w:top w:w="90" w:type="dxa"/>
-              <w:left w:w="195" w:type="dxa"/>
-              <w:bottom w:w="90" w:type="dxa"/>
-              <w:right w:w="195" w:type="dxa"/>
-            </w:tcMar>
-            <w:vAlign w:val="center"/>
-            <w:hideMark/>
-          </w:tcPr>
-          <w:p>
-            <w:pPr>
-              <w:spacing w:before="150" w:after="225"/>
+              <w:t>Error</w:t>
+            </w:r>
+            <w:r>
               <w:rPr>
                 <w:sz w:val="20"/>
                 <w:szCs w:val="20"/>
               </w:rPr>
-            </w:pPr>
-          </w:p>
-        </w:tc>
-        <w:tc>
-          <w:tcPr>
-            <w:tcW w:w="0" w:type="auto"/>
-            <w:shd w:val="clear" w:color="auto" w:fill="FFFFFF"/>
-            <w:tcMar>
-              <w:top w:w="90" w:type="dxa"/>
-              <w:left w:w="195" w:type="dxa"/>
-              <w:bottom w:w="90" w:type="dxa"/>
-              <w:right w:w="195" w:type="dxa"/>
-            </w:tcMar>
-            <w:vAlign w:val="center"/>
-            <w:hideMark/>
-          </w:tcPr>
-          <w:p>
-            <w:pPr>
-              <w:spacing w:before="150" w:after="225"/>
+              <w:t xml:space="preserve"> removing license plates from list in config file when a car is outgoing. Using the pytohn debigger, identified issue: </w:t>
+            </w:r>
+            <w:r>
               <w:rPr>
                 <w:sz w:val="20"/>
                 <w:szCs w:val="20"/>
               </w:rPr>
-            </w:pPr>
-          </w:p>
-        </w:tc>
-      </w:tr>
-      <w:tr>
-        <w:tc>
-          <w:tcPr>
-            <w:tcW w:w="0" w:type="auto"/>
-            <w:shd w:val="clear" w:color="auto" w:fill="FFFFFF"/>
-            <w:tcMar>
-              <w:top w:w="90" w:type="dxa"/>
-              <w:left w:w="195" w:type="dxa"/>
-              <w:bottom w:w="90" w:type="dxa"/>
-              <w:right w:w="195" w:type="dxa"/>
-            </w:tcMar>
-            <w:vAlign w:val="center"/>
-            <w:hideMark/>
-          </w:tcPr>
-          <w:p>
-            <w:pPr>
-              <w:spacing w:before="150" w:after="225"/>
+              <w:t>Using pop() to remove</w:t>
+            </w:r>
+            <w:r>
               <w:rPr>
                 <w:sz w:val="20"/>
                 <w:szCs w:val="20"/>
               </w:rPr>
-            </w:pPr>
-          </w:p>
-        </w:tc>
-        <w:tc>
-          <w:tcPr>
-            <w:tcW w:w="0" w:type="auto"/>
-            <w:shd w:val="clear" w:color="auto" w:fill="FFFFFF"/>
-            <w:tcMar>
-              <w:top w:w="90" w:type="dxa"/>
-              <w:left w:w="195" w:type="dxa"/>
-              <w:bottom w:w="90" w:type="dxa"/>
-              <w:right w:w="195" w:type="dxa"/>
-            </w:tcMar>
-            <w:vAlign w:val="center"/>
-            <w:hideMark/>
-          </w:tcPr>
-          <w:p>
-            <w:pPr>
-              <w:spacing w:before="150" w:after="225"/>
+              <w:t xml:space="preserve"> strings in list but causing error wh</w:t>
+            </w:r>
+            <w:r>
               <w:rPr>
                 <w:sz w:val="20"/>
                 <w:szCs w:val="20"/>
               </w:rPr>
-            </w:pPr>
-          </w:p>
-        </w:tc>
-        <w:tc>
-          <w:tcPr>
-            <w:tcW w:w="0" w:type="auto"/>
-            <w:shd w:val="clear" w:color="auto" w:fill="FFFFFF"/>
-            <w:tcMar>
-              <w:top w:w="90" w:type="dxa"/>
-              <w:left w:w="195" w:type="dxa"/>
-              <w:bottom w:w="90" w:type="dxa"/>
-              <w:right w:w="195" w:type="dxa"/>
-            </w:tcMar>
-            <w:vAlign w:val="center"/>
-            <w:hideMark/>
-          </w:tcPr>
-          <w:p>
-            <w:pPr>
-              <w:spacing w:before="150" w:after="225"/>
+              <w:t xml:space="preserve">en the string isnt in the list. I changed the function from pop() to remove() which doesn’t </w:t>
+            </w:r>
+            <w:r>
               <w:rPr>
                 <w:sz w:val="20"/>
                 <w:szCs w:val="20"/>
               </w:rPr>
-            </w:pPr>
+              <w:t>raise that error in the same conditions</w:t>
+            </w:r>
           </w:p>
         </w:tc>
       </w:tr>
@@ -2938,6 +3041,54 @@
         <w:shd w:val="clear" w:color="auto" w:fill="FFFFFF"/>
         <w:spacing w:before="0" w:beforeAutospacing="0" w:after="240" w:afterAutospacing="0"/>
         <w:rPr>
+          <w:rStyle w:val="Strong"/>
+          <w:rFonts w:ascii="Helvetica Neue" w:hAnsi="Helvetica Neue"/>
+          <w:color w:val="000000"/>
+        </w:rPr>
+      </w:pPr>
+    </w:p>
+    <w:p>
+      <w:pPr>
+        <w:pStyle w:val="NormalWeb"/>
+        <w:shd w:val="clear" w:color="auto" w:fill="FFFFFF"/>
+        <w:spacing w:before="0" w:beforeAutospacing="0" w:after="240" w:afterAutospacing="0"/>
+        <w:rPr>
+          <w:rStyle w:val="Strong"/>
+          <w:rFonts w:ascii="Helvetica Neue" w:hAnsi="Helvetica Neue"/>
+          <w:color w:val="000000"/>
+        </w:rPr>
+      </w:pPr>
+    </w:p>
+    <w:p>
+      <w:pPr>
+        <w:pStyle w:val="NormalWeb"/>
+        <w:shd w:val="clear" w:color="auto" w:fill="FFFFFF"/>
+        <w:spacing w:before="0" w:beforeAutospacing="0" w:after="240" w:afterAutospacing="0"/>
+        <w:rPr>
+          <w:rStyle w:val="Strong"/>
+          <w:rFonts w:ascii="Helvetica Neue" w:hAnsi="Helvetica Neue"/>
+          <w:color w:val="000000"/>
+        </w:rPr>
+      </w:pPr>
+    </w:p>
+    <w:p>
+      <w:pPr>
+        <w:pStyle w:val="NormalWeb"/>
+        <w:shd w:val="clear" w:color="auto" w:fill="FFFFFF"/>
+        <w:spacing w:before="0" w:beforeAutospacing="0" w:after="240" w:afterAutospacing="0"/>
+        <w:rPr>
+          <w:rStyle w:val="Strong"/>
+          <w:rFonts w:ascii="Helvetica Neue" w:hAnsi="Helvetica Neue"/>
+          <w:color w:val="000000"/>
+        </w:rPr>
+      </w:pPr>
+    </w:p>
+    <w:p>
+      <w:pPr>
+        <w:pStyle w:val="NormalWeb"/>
+        <w:shd w:val="clear" w:color="auto" w:fill="FFFFFF"/>
+        <w:spacing w:before="0" w:beforeAutospacing="0" w:after="240" w:afterAutospacing="0"/>
+        <w:rPr>
           <w:rFonts w:ascii="Helvetica Neue" w:hAnsi="Helvetica Neue"/>
           <w:color w:val="333333"/>
         </w:rPr>
@@ -2948,6 +3099,7 @@
           <w:rFonts w:ascii="Helvetica Neue" w:hAnsi="Helvetica Neue"/>
           <w:color w:val="000000"/>
         </w:rPr>
+        <w:lastRenderedPageBreak/>
         <w:t xml:space="preserve">Section </w:t>
       </w:r>
       <w:r>
@@ -2988,9 +3140,9 @@
         <w:tblLook w:val="04A0" w:firstRow="1" w:lastRow="0" w:firstColumn="1" w:lastColumn="0" w:noHBand="0" w:noVBand="1"/>
       </w:tblPr>
       <w:tblGrid>
-        <w:gridCol w:w="860"/>
-        <w:gridCol w:w="2226"/>
-        <w:gridCol w:w="4998"/>
+        <w:gridCol w:w="1260"/>
+        <w:gridCol w:w="2171"/>
+        <w:gridCol w:w="4653"/>
       </w:tblGrid>
       <w:tr>
         <w:trPr>
@@ -3127,6 +3279,15 @@
                 <w:color w:val="000000"/>
               </w:rPr>
             </w:pPr>
+            <w:r>
+              <w:rPr>
+                <w:rFonts w:ascii="Helvetica Neue" w:hAnsi="Helvetica Neue"/>
+                <w:b/>
+                <w:bCs/>
+                <w:color w:val="000000"/>
+              </w:rPr>
+              <w:t>30/11/25</w:t>
+            </w:r>
           </w:p>
         </w:tc>
         <w:tc>
@@ -3150,6 +3311,13 @@
                 <w:szCs w:val="20"/>
               </w:rPr>
             </w:pPr>
+            <w:r>
+              <w:rPr>
+                <w:sz w:val="20"/>
+                <w:szCs w:val="20"/>
+              </w:rPr>
+              <w:t>Edge case handling</w:t>
+            </w:r>
           </w:p>
         </w:tc>
         <w:tc>
@@ -3173,23 +3341,21 @@
                 <w:szCs w:val="20"/>
               </w:rPr>
             </w:pPr>
-          </w:p>
-        </w:tc>
-      </w:tr>
-      <w:tr>
-        <w:tc>
-          <w:tcPr>
-            <w:tcW w:w="0" w:type="auto"/>
-            <w:shd w:val="clear" w:color="auto" w:fill="FFFFFF"/>
-            <w:tcMar>
-              <w:top w:w="90" w:type="dxa"/>
-              <w:left w:w="195" w:type="dxa"/>
-              <w:bottom w:w="90" w:type="dxa"/>
-              <w:right w:w="195" w:type="dxa"/>
-            </w:tcMar>
-            <w:vAlign w:val="center"/>
-            <w:hideMark/>
-          </w:tcPr>
+            <w:r>
+              <w:rPr>
+                <w:sz w:val="20"/>
+                <w:szCs w:val="20"/>
+              </w:rPr>
+              <w:t xml:space="preserve">Reviewed requirement and checklist documents and user stories to clarify </w:t>
+            </w:r>
+            <w:r>
+              <w:rPr>
+                <w:sz w:val="20"/>
+                <w:szCs w:val="20"/>
+              </w:rPr>
+              <w:t>edge cases</w:t>
+            </w:r>
+          </w:p>
           <w:p>
             <w:pPr>
               <w:spacing w:before="150" w:after="225"/>
@@ -3198,123 +3364,20 @@
                 <w:szCs w:val="20"/>
               </w:rPr>
             </w:pPr>
-          </w:p>
-        </w:tc>
-        <w:tc>
-          <w:tcPr>
-            <w:tcW w:w="0" w:type="auto"/>
-            <w:shd w:val="clear" w:color="auto" w:fill="FFFFFF"/>
-            <w:tcMar>
-              <w:top w:w="90" w:type="dxa"/>
-              <w:left w:w="195" w:type="dxa"/>
-              <w:bottom w:w="90" w:type="dxa"/>
-              <w:right w:w="195" w:type="dxa"/>
-            </w:tcMar>
-            <w:vAlign w:val="center"/>
-            <w:hideMark/>
-          </w:tcPr>
-          <w:p>
-            <w:pPr>
-              <w:spacing w:before="150" w:after="225"/>
+            <w:r>
               <w:rPr>
                 <w:sz w:val="20"/>
                 <w:szCs w:val="20"/>
               </w:rPr>
-            </w:pPr>
-          </w:p>
-        </w:tc>
-        <w:tc>
-          <w:tcPr>
-            <w:tcW w:w="0" w:type="auto"/>
-            <w:shd w:val="clear" w:color="auto" w:fill="FFFFFF"/>
-            <w:tcMar>
-              <w:top w:w="90" w:type="dxa"/>
-              <w:left w:w="195" w:type="dxa"/>
-              <w:bottom w:w="90" w:type="dxa"/>
-              <w:right w:w="195" w:type="dxa"/>
-            </w:tcMar>
-            <w:vAlign w:val="center"/>
-            <w:hideMark/>
-          </w:tcPr>
-          <w:p>
-            <w:pPr>
-              <w:spacing w:before="150" w:after="225"/>
+              <w:t xml:space="preserve">Introduce </w:t>
+            </w:r>
+            <w:r>
               <w:rPr>
                 <w:sz w:val="20"/>
                 <w:szCs w:val="20"/>
               </w:rPr>
-            </w:pPr>
-          </w:p>
-        </w:tc>
-      </w:tr>
-      <w:tr>
-        <w:tc>
-          <w:tcPr>
-            <w:tcW w:w="0" w:type="auto"/>
-            <w:shd w:val="clear" w:color="auto" w:fill="FFFFFF"/>
-            <w:tcMar>
-              <w:top w:w="90" w:type="dxa"/>
-              <w:left w:w="195" w:type="dxa"/>
-              <w:bottom w:w="90" w:type="dxa"/>
-              <w:right w:w="195" w:type="dxa"/>
-            </w:tcMar>
-            <w:vAlign w:val="center"/>
-            <w:hideMark/>
-          </w:tcPr>
-          <w:p>
-            <w:pPr>
-              <w:spacing w:before="150" w:after="225"/>
-              <w:rPr>
-                <w:sz w:val="20"/>
-                <w:szCs w:val="20"/>
-              </w:rPr>
-            </w:pPr>
-          </w:p>
-        </w:tc>
-        <w:tc>
-          <w:tcPr>
-            <w:tcW w:w="0" w:type="auto"/>
-            <w:shd w:val="clear" w:color="auto" w:fill="FFFFFF"/>
-            <w:tcMar>
-              <w:top w:w="90" w:type="dxa"/>
-              <w:left w:w="195" w:type="dxa"/>
-              <w:bottom w:w="90" w:type="dxa"/>
-              <w:right w:w="195" w:type="dxa"/>
-            </w:tcMar>
-            <w:vAlign w:val="center"/>
-            <w:hideMark/>
-          </w:tcPr>
-          <w:p>
-            <w:pPr>
-              <w:spacing w:before="150" w:after="225"/>
-              <w:rPr>
-                <w:sz w:val="20"/>
-                <w:szCs w:val="20"/>
-              </w:rPr>
-            </w:pPr>
-          </w:p>
-        </w:tc>
-        <w:tc>
-          <w:tcPr>
-            <w:tcW w:w="0" w:type="auto"/>
-            <w:shd w:val="clear" w:color="auto" w:fill="FFFFFF"/>
-            <w:tcMar>
-              <w:top w:w="90" w:type="dxa"/>
-              <w:left w:w="195" w:type="dxa"/>
-              <w:bottom w:w="90" w:type="dxa"/>
-              <w:right w:w="195" w:type="dxa"/>
-            </w:tcMar>
-            <w:vAlign w:val="center"/>
-            <w:hideMark/>
-          </w:tcPr>
-          <w:p>
-            <w:pPr>
-              <w:spacing w:before="150" w:after="225"/>
-              <w:rPr>
-                <w:sz w:val="20"/>
-                <w:szCs w:val="20"/>
-              </w:rPr>
-            </w:pPr>
+              <w:t>checks before operations to prevent edge cases</w:t>
+            </w:r>
           </w:p>
         </w:tc>
       </w:tr>
@@ -4504,6 +4567,7 @@
               <w14:uncheckedState w14:val="2610" w14:font="MS Gothic"/>
             </w14:checkbox>
           </w:sdtPr>
+          <w:sdtEndPr/>
           <w:sdtContent>
             <w:tc>
               <w:tcPr>
@@ -4585,6 +4649,7 @@
               <w14:uncheckedState w14:val="2610" w14:font="MS Gothic"/>
             </w14:checkbox>
           </w:sdtPr>
+          <w:sdtEndPr/>
           <w:sdtContent>
             <w:tc>
               <w:tcPr>
@@ -4662,6 +4727,7 @@
               <w14:uncheckedState w14:val="2610" w14:font="MS Gothic"/>
             </w14:checkbox>
           </w:sdtPr>
+          <w:sdtEndPr/>
           <w:sdtContent>
             <w:tc>
               <w:tcPr>
@@ -4748,6 +4814,7 @@
               <w14:uncheckedState w14:val="2610" w14:font="MS Gothic"/>
             </w14:checkbox>
           </w:sdtPr>
+          <w:sdtEndPr/>
           <w:sdtContent>
             <w:tc>
               <w:tcPr>
@@ -4834,6 +4901,7 @@
               <w14:uncheckedState w14:val="2610" w14:font="MS Gothic"/>
             </w14:checkbox>
           </w:sdtPr>
+          <w:sdtEndPr/>
           <w:sdtContent>
             <w:tc>
               <w:tcPr>
@@ -4923,6 +4991,7 @@
               <w14:uncheckedState w14:val="2610" w14:font="MS Gothic"/>
             </w14:checkbox>
           </w:sdtPr>
+          <w:sdtEndPr/>
           <w:sdtContent>
             <w:tc>
               <w:tcPr>
@@ -4980,13 +5049,8 @@
             <w:tcW w:w="7796" w:type="dxa"/>
           </w:tcPr>
           <w:p>
-            <w:proofErr w:type="gramStart"/>
-            <w:r>
-              <w:t>Includes .git</w:t>
-            </w:r>
-            <w:proofErr w:type="gramEnd"/>
-            <w:r>
-              <w:t xml:space="preserve"> folder with source</w:t>
+            <w:r>
+              <w:t>Includes .git folder with source</w:t>
             </w:r>
           </w:p>
         </w:tc>
@@ -5005,6 +5069,7 @@
               <w14:uncheckedState w14:val="2610" w14:font="MS Gothic"/>
             </w14:checkbox>
           </w:sdtPr>
+          <w:sdtEndPr/>
           <w:sdtContent>
             <w:tc>
               <w:tcPr>
@@ -5063,13 +5128,8 @@
             <w:tcW w:w="7796" w:type="dxa"/>
           </w:tcPr>
           <w:p>
-            <w:proofErr w:type="spellStart"/>
-            <w:r>
-              <w:t>Git</w:t>
-            </w:r>
-            <w:proofErr w:type="spellEnd"/>
-            <w:r>
-              <w:t xml:space="preserve"> repo shows evidence of origin (their fork) and upstream (repository forked from)</w:t>
+            <w:r>
+              <w:t>Git repo shows evidence of origin (their fork) and upstream (repository forked from)</w:t>
             </w:r>
           </w:p>
         </w:tc>
@@ -5088,6 +5148,7 @@
               <w14:uncheckedState w14:val="2610" w14:font="MS Gothic"/>
             </w14:checkbox>
           </w:sdtPr>
+          <w:sdtEndPr/>
           <w:sdtContent>
             <w:tc>
               <w:tcPr>
@@ -5165,6 +5226,7 @@
               <w14:uncheckedState w14:val="2610" w14:font="MS Gothic"/>
             </w14:checkbox>
           </w:sdtPr>
+          <w:sdtEndPr/>
           <w:sdtContent>
             <w:tc>
               <w:tcPr>
@@ -5242,6 +5304,7 @@
               <w14:uncheckedState w14:val="2610" w14:font="MS Gothic"/>
             </w14:checkbox>
           </w:sdtPr>
+          <w:sdtEndPr/>
           <w:sdtContent>
             <w:tc>
               <w:tcPr>
@@ -5319,6 +5382,7 @@
               <w14:uncheckedState w14:val="2610" w14:font="MS Gothic"/>
             </w14:checkbox>
           </w:sdtPr>
+          <w:sdtEndPr/>
           <w:sdtContent>
             <w:tc>
               <w:tcPr>
@@ -5813,7 +5877,7 @@
               <w:sz w:val="16"/>
               <w:szCs w:val="16"/>
             </w:rPr>
-            <w:t>2025-11-19 11:40</w:t>
+            <w:t>2025-11-19 11:42</w:t>
           </w:r>
           <w:r>
             <w:rPr>
@@ -10846,7 +10910,6 @@
   <w:style w:type="character" w:default="1" w:styleId="DefaultParagraphFont">
     <w:name w:val="Default Paragraph Font"/>
     <w:uiPriority w:val="1"/>
-    <w:semiHidden/>
     <w:unhideWhenUsed/>
   </w:style>
   <w:style w:type="table" w:default="1" w:styleId="TableNormal">
@@ -12441,74 +12504,6 @@
 </file>
 
 <file path=customXml/item1.xml><?xml version="1.0" encoding="utf-8"?>
-<p:properties xmlns:p="http://schemas.microsoft.com/office/2006/metadata/properties" xmlns:xsi="http://www.w3.org/2001/XMLSchema-instance" xmlns:pc="http://schemas.microsoft.com/office/infopath/2007/PartnerControls">
-  <documentManagement>
-    <FolderType xmlns="833ce3ab-d172-455c-9989-f10facae9784" xsi:nil="true"/>
-    <Students xmlns="833ce3ab-d172-455c-9989-f10facae9784">
-      <UserInfo>
-        <DisplayName/>
-        <AccountId xsi:nil="true"/>
-        <AccountType/>
-      </UserInfo>
-    </Students>
-    <TeamsChannelId xmlns="833ce3ab-d172-455c-9989-f10facae9784" xsi:nil="true"/>
-    <Student_Groups xmlns="833ce3ab-d172-455c-9989-f10facae9784">
-      <UserInfo>
-        <DisplayName/>
-        <AccountId xsi:nil="true"/>
-        <AccountType/>
-      </UserInfo>
-    </Student_Groups>
-    <Math_Settings xmlns="833ce3ab-d172-455c-9989-f10facae9784" xsi:nil="true"/>
-    <Is_Collaboration_Space_Locked xmlns="833ce3ab-d172-455c-9989-f10facae9784" xsi:nil="true"/>
-    <AppVersion xmlns="833ce3ab-d172-455c-9989-f10facae9784" xsi:nil="true"/>
-    <Owner xmlns="833ce3ab-d172-455c-9989-f10facae9784">
-      <UserInfo>
-        <DisplayName/>
-        <AccountId xsi:nil="true"/>
-        <AccountType/>
-      </UserInfo>
-    </Owner>
-    <Has_Teacher_Only_SectionGroup xmlns="833ce3ab-d172-455c-9989-f10facae9784" xsi:nil="true"/>
-    <NotebookType xmlns="833ce3ab-d172-455c-9989-f10facae9784" xsi:nil="true"/>
-    <Teachers xmlns="833ce3ab-d172-455c-9989-f10facae9784">
-      <UserInfo>
-        <DisplayName/>
-        <AccountId xsi:nil="true"/>
-        <AccountType/>
-      </UserInfo>
-    </Teachers>
-    <Templates xmlns="833ce3ab-d172-455c-9989-f10facae9784" xsi:nil="true"/>
-    <DefaultSectionNames xmlns="833ce3ab-d172-455c-9989-f10facae9784" xsi:nil="true"/>
-    <CultureName xmlns="833ce3ab-d172-455c-9989-f10facae9784" xsi:nil="true"/>
-    <Distribution_Groups xmlns="833ce3ab-d172-455c-9989-f10facae9784" xsi:nil="true"/>
-    <Self_Registration_Enabled xmlns="833ce3ab-d172-455c-9989-f10facae9784" xsi:nil="true"/>
-    <LMS_Mappings xmlns="833ce3ab-d172-455c-9989-f10facae9784" xsi:nil="true"/>
-    <Invited_Teachers xmlns="833ce3ab-d172-455c-9989-f10facae9784" xsi:nil="true"/>
-    <Invited_Students xmlns="833ce3ab-d172-455c-9989-f10facae9784" xsi:nil="true"/>
-    <IsNotebookLocked xmlns="833ce3ab-d172-455c-9989-f10facae9784" xsi:nil="true"/>
-  </documentManagement>
-</p:properties>
-</file>
-
-<file path=customXml/item2.xml><?xml version="1.0" encoding="utf-8"?>
-<?mso-contentType ?>
-<FormTemplates xmlns="http://schemas.microsoft.com/sharepoint/v3/contenttype/forms">
-  <Display>DocumentLibraryForm</Display>
-  <Edit>DocumentLibraryForm</Edit>
-  <New>DocumentLibraryForm</New>
-</FormTemplates>
-</file>
-
-<file path=customXml/item3.xml><?xml version="1.0" encoding="utf-8"?>
-<LongProperties xmlns="http://schemas.microsoft.com/office/2006/metadata/longProperties"/>
-</file>
-
-<file path=customXml/item4.xml><?xml version="1.0" encoding="utf-8"?>
-<b:Sources xmlns:b="http://schemas.openxmlformats.org/officeDocument/2006/bibliography" xmlns="http://schemas.openxmlformats.org/officeDocument/2006/bibliography" SelectedStyle="\APA.XSL" StyleName="APA"/>
-</file>
-
-<file path=customXml/item5.xml><?xml version="1.0" encoding="utf-8"?>
 <ct:contentTypeSchema xmlns:ct="http://schemas.microsoft.com/office/2006/metadata/contentType" xmlns:ma="http://schemas.microsoft.com/office/2006/metadata/properties/metaAttributes" ct:_="" ma:_="" ma:contentTypeName="Document" ma:contentTypeID="0x010100D482CBA738D00D4AAC9330883AE1DA78" ma:contentTypeVersion="33" ma:contentTypeDescription="Create a new document." ma:contentTypeScope="" ma:versionID="8e47dcab4e34a32242880baf61f0a73d">
   <xsd:schema xmlns:xsd="http://www.w3.org/2001/XMLSchema" xmlns:xs="http://www.w3.org/2001/XMLSchema" xmlns:p="http://schemas.microsoft.com/office/2006/metadata/properties" xmlns:ns3="3936cbe9-feea-4685-b03c-7f8d09c550f1" xmlns:ns4="833ce3ab-d172-455c-9989-f10facae9784" targetNamespace="http://schemas.microsoft.com/office/2006/metadata/properties" ma:root="true" ma:fieldsID="174389be43a91ce68753c33b6ac99b4e" ns3:_="" ns4:_="">
     <xsd:import namespace="3936cbe9-feea-4685-b03c-7f8d09c550f1"/>
@@ -12919,41 +12914,75 @@
 </ct:contentTypeSchema>
 </file>
 
-<file path=customXml/itemProps1.xml><?xml version="1.0" encoding="utf-8"?>
-<ds:datastoreItem xmlns:ds="http://schemas.openxmlformats.org/officeDocument/2006/customXml" ds:itemID="{A16F99D5-FAF9-47B7-BB2E-CAC1EF9F3B71}">
-  <ds:schemaRefs>
-    <ds:schemaRef ds:uri="http://schemas.microsoft.com/office/2006/metadata/properties"/>
-    <ds:schemaRef ds:uri="http://schemas.microsoft.com/office/infopath/2007/PartnerControls"/>
-    <ds:schemaRef ds:uri="833ce3ab-d172-455c-9989-f10facae9784"/>
-  </ds:schemaRefs>
-</ds:datastoreItem>
+<file path=customXml/item2.xml><?xml version="1.0" encoding="utf-8"?>
+<b:Sources xmlns:b="http://schemas.openxmlformats.org/officeDocument/2006/bibliography" xmlns="http://schemas.openxmlformats.org/officeDocument/2006/bibliography" SelectedStyle="\APA.XSL" StyleName="APA"/>
 </file>
 
-<file path=customXml/itemProps2.xml><?xml version="1.0" encoding="utf-8"?>
-<ds:datastoreItem xmlns:ds="http://schemas.openxmlformats.org/officeDocument/2006/customXml" ds:itemID="{96001339-1F25-4BDD-94F9-AA3400008571}">
-  <ds:schemaRefs>
-    <ds:schemaRef ds:uri="http://schemas.microsoft.com/sharepoint/v3/contenttype/forms"/>
-  </ds:schemaRefs>
-</ds:datastoreItem>
+<file path=customXml/item3.xml><?xml version="1.0" encoding="utf-8"?>
+<LongProperties xmlns="http://schemas.microsoft.com/office/2006/metadata/longProperties"/>
 </file>
 
-<file path=customXml/itemProps3.xml><?xml version="1.0" encoding="utf-8"?>
-<ds:datastoreItem xmlns:ds="http://schemas.openxmlformats.org/officeDocument/2006/customXml" ds:itemID="{ED9C3AC7-65F6-444B-AAD9-BED76FF91658}">
-  <ds:schemaRefs>
-    <ds:schemaRef ds:uri="http://schemas.microsoft.com/office/2006/metadata/longProperties"/>
-  </ds:schemaRefs>
-</ds:datastoreItem>
+<file path=customXml/item4.xml><?xml version="1.0" encoding="utf-8"?>
+<?mso-contentType ?>
+<FormTemplates xmlns="http://schemas.microsoft.com/sharepoint/v3/contenttype/forms">
+  <Display>DocumentLibraryForm</Display>
+  <Edit>DocumentLibraryForm</Edit>
+  <New>DocumentLibraryForm</New>
+</FormTemplates>
 </file>
 
-<file path=customXml/itemProps4.xml><?xml version="1.0" encoding="utf-8"?>
-<ds:datastoreItem xmlns:ds="http://schemas.openxmlformats.org/officeDocument/2006/customXml" ds:itemID="{3E4AA18B-56ED-4D7C-8E8B-C59D0F4C5163}">
-  <ds:schemaRefs>
-    <ds:schemaRef ds:uri="http://schemas.openxmlformats.org/officeDocument/2006/bibliography"/>
-  </ds:schemaRefs>
-</ds:datastoreItem>
+<file path=customXml/item5.xml><?xml version="1.0" encoding="utf-8"?>
+<p:properties xmlns:p="http://schemas.microsoft.com/office/2006/metadata/properties" xmlns:xsi="http://www.w3.org/2001/XMLSchema-instance" xmlns:pc="http://schemas.microsoft.com/office/infopath/2007/PartnerControls">
+  <documentManagement>
+    <FolderType xmlns="833ce3ab-d172-455c-9989-f10facae9784" xsi:nil="true"/>
+    <Students xmlns="833ce3ab-d172-455c-9989-f10facae9784">
+      <UserInfo>
+        <DisplayName/>
+        <AccountId xsi:nil="true"/>
+        <AccountType/>
+      </UserInfo>
+    </Students>
+    <TeamsChannelId xmlns="833ce3ab-d172-455c-9989-f10facae9784" xsi:nil="true"/>
+    <Student_Groups xmlns="833ce3ab-d172-455c-9989-f10facae9784">
+      <UserInfo>
+        <DisplayName/>
+        <AccountId xsi:nil="true"/>
+        <AccountType/>
+      </UserInfo>
+    </Student_Groups>
+    <Math_Settings xmlns="833ce3ab-d172-455c-9989-f10facae9784" xsi:nil="true"/>
+    <Is_Collaboration_Space_Locked xmlns="833ce3ab-d172-455c-9989-f10facae9784" xsi:nil="true"/>
+    <AppVersion xmlns="833ce3ab-d172-455c-9989-f10facae9784" xsi:nil="true"/>
+    <Owner xmlns="833ce3ab-d172-455c-9989-f10facae9784">
+      <UserInfo>
+        <DisplayName/>
+        <AccountId xsi:nil="true"/>
+        <AccountType/>
+      </UserInfo>
+    </Owner>
+    <Has_Teacher_Only_SectionGroup xmlns="833ce3ab-d172-455c-9989-f10facae9784" xsi:nil="true"/>
+    <NotebookType xmlns="833ce3ab-d172-455c-9989-f10facae9784" xsi:nil="true"/>
+    <Teachers xmlns="833ce3ab-d172-455c-9989-f10facae9784">
+      <UserInfo>
+        <DisplayName/>
+        <AccountId xsi:nil="true"/>
+        <AccountType/>
+      </UserInfo>
+    </Teachers>
+    <Templates xmlns="833ce3ab-d172-455c-9989-f10facae9784" xsi:nil="true"/>
+    <DefaultSectionNames xmlns="833ce3ab-d172-455c-9989-f10facae9784" xsi:nil="true"/>
+    <CultureName xmlns="833ce3ab-d172-455c-9989-f10facae9784" xsi:nil="true"/>
+    <Distribution_Groups xmlns="833ce3ab-d172-455c-9989-f10facae9784" xsi:nil="true"/>
+    <Self_Registration_Enabled xmlns="833ce3ab-d172-455c-9989-f10facae9784" xsi:nil="true"/>
+    <LMS_Mappings xmlns="833ce3ab-d172-455c-9989-f10facae9784" xsi:nil="true"/>
+    <Invited_Teachers xmlns="833ce3ab-d172-455c-9989-f10facae9784" xsi:nil="true"/>
+    <Invited_Students xmlns="833ce3ab-d172-455c-9989-f10facae9784" xsi:nil="true"/>
+    <IsNotebookLocked xmlns="833ce3ab-d172-455c-9989-f10facae9784" xsi:nil="true"/>
+  </documentManagement>
+</p:properties>
 </file>
 
-<file path=customXml/itemProps5.xml><?xml version="1.0" encoding="utf-8"?>
+<file path=customXml/itemProps1.xml><?xml version="1.0" encoding="utf-8"?>
 <ds:datastoreItem xmlns:ds="http://schemas.openxmlformats.org/officeDocument/2006/customXml" ds:itemID="{C3B379D3-68ED-4924-9080-2CFFEEB38B90}">
   <ds:schemaRefs>
     <ds:schemaRef ds:uri="http://schemas.microsoft.com/office/2006/metadata/contentType"/>
@@ -12970,4 +12999,38 @@
     <ds:schemaRef ds:uri="http://schemas.microsoft.com/internal/obd"/>
   </ds:schemaRefs>
 </ds:datastoreItem>
+</file>
+
+<file path=customXml/itemProps2.xml><?xml version="1.0" encoding="utf-8"?>
+<ds:datastoreItem xmlns:ds="http://schemas.openxmlformats.org/officeDocument/2006/customXml" ds:itemID="{3E4AA18B-56ED-4D7C-8E8B-C59D0F4C5163}">
+  <ds:schemaRefs>
+    <ds:schemaRef ds:uri="http://schemas.openxmlformats.org/officeDocument/2006/bibliography"/>
+  </ds:schemaRefs>
+</ds:datastoreItem>
+</file>
+
+<file path=customXml/itemProps3.xml><?xml version="1.0" encoding="utf-8"?>
+<ds:datastoreItem xmlns:ds="http://schemas.openxmlformats.org/officeDocument/2006/customXml" ds:itemID="{ED9C3AC7-65F6-444B-AAD9-BED76FF91658}">
+  <ds:schemaRefs>
+    <ds:schemaRef ds:uri="http://schemas.microsoft.com/office/2006/metadata/longProperties"/>
+  </ds:schemaRefs>
+</ds:datastoreItem>
+</file>
+
+<file path=customXml/itemProps4.xml><?xml version="1.0" encoding="utf-8"?>
+<ds:datastoreItem xmlns:ds="http://schemas.openxmlformats.org/officeDocument/2006/customXml" ds:itemID="{96001339-1F25-4BDD-94F9-AA3400008571}">
+  <ds:schemaRefs>
+    <ds:schemaRef ds:uri="http://schemas.microsoft.com/sharepoint/v3/contenttype/forms"/>
+  </ds:schemaRefs>
+</ds:datastoreItem>
+</file>
+
+<file path=customXml/itemProps5.xml><?xml version="1.0" encoding="utf-8"?>
+<ds:datastoreItem xmlns:ds="http://schemas.openxmlformats.org/officeDocument/2006/customXml" ds:itemID="{A16F99D5-FAF9-47B7-BB2E-CAC1EF9F3B71}">
+  <ds:schemaRefs>
+    <ds:schemaRef ds:uri="http://schemas.microsoft.com/office/2006/metadata/properties"/>
+    <ds:schemaRef ds:uri="http://schemas.microsoft.com/office/infopath/2007/PartnerControls"/>
+    <ds:schemaRef ds:uri="833ce3ab-d172-455c-9989-f10facae9784"/>
+  </ds:schemaRefs>
+</ds:datastoreItem>
 </file>
</xml_diff>